<commit_message>
Report §2.2: correct duplicate-count explanation (57 exact vs 99 text-level dedup)
</commit_message>
<xml_diff>
--- a/report/ITC6110_report.docx
+++ b/report/ITC6110_report.docx
@@ -48,7 +48,7 @@
         <w:t>Team Members:</w:t>
       </w:r>
       <w:r>
-        <w:t xml:space="preserve"> [NAME 1] · [NAME 2] · [NAME 3]</w:t>
+        <w:t xml:space="preserve"> George Antonakis · Orestis Pappas · Samuel Cook</w:t>
       </w:r>
     </w:p>
     <w:p>
@@ -395,7 +395,10 @@
           </w:tcPr>
           <w:p>
             <w:r>
-              <w:t>**Total**</w:t>
+              <w:rPr>
+                <w:b/>
+              </w:rPr>
+              <w:t>Total</w:t>
             </w:r>
           </w:p>
         </w:tc>
@@ -405,7 +408,10 @@
           </w:tcPr>
           <w:p>
             <w:r>
-              <w:t>**1,225**</w:t>
+              <w:rPr>
+                <w:b/>
+              </w:rPr>
+              <w:t>1,225</w:t>
             </w:r>
           </w:p>
         </w:tc>
@@ -415,7 +421,10 @@
           </w:tcPr>
           <w:p>
             <w:r>
-              <w:t>**1,000**</w:t>
+              <w:rPr>
+                <w:b/>
+              </w:rPr>
+              <w:t>1,000</w:t>
             </w:r>
           </w:p>
         </w:tc>
@@ -425,7 +434,10 @@
           </w:tcPr>
           <w:p>
             <w:r>
-              <w:t>**2,225**</w:t>
+              <w:rPr>
+                <w:b/>
+              </w:rPr>
+              <w:t>2,225</w:t>
             </w:r>
           </w:p>
         </w:tc>
@@ -486,19 +498,51 @@
       <w:r>
         <w:rPr>
           <w:rFonts w:ascii="Courier New" w:hAnsi="Courier New"/>
-          <w:sz w:val="18"/>
+          <w:sz w:val="20"/>
         </w:rPr>
+        <w:t>`</w:t>
+      </w:r>
+      <w:r>
+        <w:t>python</w:t>
+      </w:r>
+    </w:p>
+    <w:p>
+      <w:r>
         <w:t>from datasets import load_dataset</w:t>
-        <w:br/>
+      </w:r>
+    </w:p>
+    <w:p>
+      <w:r>
         <w:t>import pandas as pd</w:t>
-        <w:br/>
+      </w:r>
+    </w:p>
+    <w:p>
+      <w:r>
         <w:t>ds = load_dataset("SetFit/bbc-news")</w:t>
-        <w:br/>
+      </w:r>
+    </w:p>
+    <w:p>
+      <w:r>
         <w:t>df = pd.concat([pd.DataFrame(ds['train']).assign(split='train'),</w:t>
-        <w:br/>
-        <w:t xml:space="preserve">                pd.DataFrame(ds['test']).assign(split='test')])</w:t>
-        <w:br/>
+      </w:r>
+    </w:p>
+    <w:p>
+      <w:r>
+        <w:t>pd.DataFrame(ds['test']).assign(split='test')])</w:t>
+      </w:r>
+    </w:p>
+    <w:p>
+      <w:r>
         <w:t>df.to_csv('data/raw/bbc_news.csv', index=False)</w:t>
+      </w:r>
+    </w:p>
+    <w:p>
+      <w:r>
+        <w:rPr>
+          <w:rFonts w:ascii="Courier New" w:hAnsi="Courier New"/>
+          <w:sz w:val="20"/>
+        </w:rPr>
+        <w:t>`</w:t>
       </w:r>
     </w:p>
     <w:p>
@@ -626,25 +670,53 @@
     </w:p>
     <w:p>
       <w:r>
-        <w:t xml:space="preserve">No missing values were found in the text or category fields. </w:t>
+        <w:t xml:space="preserve">No missing values were found in any field. Checking for exact duplicates (rows identical across all columns) flagged </w:t>
       </w:r>
       <w:r>
         <w:rPr>
           <w:b/>
         </w:rPr>
-        <w:t>57 duplicate article rows</w:t>
+        <w:t>57 rows</w:t>
       </w:r>
       <w:r>
-        <w:t xml:space="preserve"> were identified; after removing all duplicate and null rows, </w:t>
+        <w:t xml:space="preserve">. Deduplication was then applied on the article </w:t>
       </w:r>
       <w:r>
         <w:rPr>
           <w:b/>
         </w:rPr>
-        <w:t>99 rows were dropped in total, leaving 2,126 unique articles</w:t>
+        <w:t>text</w:t>
       </w:r>
       <w:r>
-        <w:t xml:space="preserve"> for the downstream pipeline. Removing duplicates before splitting prevents the same article from appearing in both train and test, which would inflate reported accuracy.</w:t>
+        <w:t xml:space="preserve"> alone (</w:t>
+      </w:r>
+      <w:r>
+        <w:rPr>
+          <w:rFonts w:ascii="Courier New" w:hAnsi="Courier New"/>
+          <w:sz w:val="20"/>
+        </w:rPr>
+        <w:t>drop_duplicates(subset='text')</w:t>
+      </w:r>
+      <w:r>
+        <w:t xml:space="preserve">), which removed </w:t>
+      </w:r>
+      <w:r>
+        <w:rPr>
+          <w:b/>
+        </w:rPr>
+        <w:t>99 rows in total</w:t>
+      </w:r>
+      <w:r>
+        <w:t xml:space="preserve"> — the 57 exact duplicates plus 42 further rows in which the same article text appeared with differing metadata, most notably the same article present in both the train and test split. This left </w:t>
+      </w:r>
+      <w:r>
+        <w:rPr>
+          <w:b/>
+        </w:rPr>
+        <w:t>2,126 unique articles</w:t>
+      </w:r>
+      <w:r>
+        <w:t>. Deduplicating on text rather than on the full row is deliberate: it is what catches an article that appears in both splits and would otherwise leak between train and test, inflating reported accuracy.</w:t>
       </w:r>
     </w:p>
     <w:p>
@@ -1403,7 +1475,10 @@
           </w:tcPr>
           <w:p>
             <w:r>
-              <w:t>**97.00%**</w:t>
+              <w:rPr>
+                <w:b/>
+              </w:rPr>
+              <w:t>97.00%</w:t>
             </w:r>
           </w:p>
         </w:tc>
@@ -1697,7 +1772,10 @@
           </w:tcPr>
           <w:p>
             <w:r>
-              <w:t>**97.53%**</w:t>
+              <w:rPr>
+                <w:b/>
+              </w:rPr>
+              <w:t>97.53%</w:t>
             </w:r>
           </w:p>
         </w:tc>
@@ -1719,7 +1797,10 @@
           </w:tcPr>
           <w:p>
             <w:r>
-              <w:t>**0.974**</w:t>
+              <w:rPr>
+                <w:b/>
+              </w:rPr>
+              <w:t>0.974</w:t>
             </w:r>
           </w:p>
         </w:tc>
@@ -1846,7 +1927,10 @@
           </w:tcPr>
           <w:p>
             <w:r>
-              <w:t>**97.53%**</w:t>
+              <w:rPr>
+                <w:b/>
+              </w:rPr>
+              <w:t>97.53%</w:t>
             </w:r>
           </w:p>
         </w:tc>
@@ -1856,7 +1940,10 @@
           </w:tcPr>
           <w:p>
             <w:r>
-              <w:t>**0.974**</w:t>
+              <w:rPr>
+                <w:b/>
+              </w:rPr>
+              <w:t>0.974</w:t>
             </w:r>
           </w:p>
         </w:tc>
@@ -2166,21 +2253,48 @@
       <w:r>
         <w:rPr>
           <w:rFonts w:ascii="Courier New" w:hAnsi="Courier New"/>
-          <w:sz w:val="18"/>
+          <w:sz w:val="20"/>
         </w:rPr>
+        <w:t>`</w:t>
+      </w:r>
+    </w:p>
+    <w:p>
+      <w:r>
         <w:t>You are a knowledgeable news assistant. Answer using only the articles provided.</w:t>
-        <w:br/>
-        <w:br/>
+      </w:r>
+    </w:p>
+    <w:p>
+      <w:r>
         <w:t>Article 1 [sport]: &lt;snippet&gt;</w:t>
-        <w:br/>
+      </w:r>
+    </w:p>
+    <w:p>
+      <w:r>
         <w:t>Article 2 [politics]: &lt;snippet&gt;</w:t>
-        <w:br/>
+      </w:r>
+    </w:p>
+    <w:p>
+      <w:r>
         <w:t>...</w:t>
-        <w:br/>
-        <w:br/>
+      </w:r>
+    </w:p>
+    <w:p>
+      <w:r>
         <w:t>Question: &lt;user query&gt;</w:t>
-        <w:br/>
+      </w:r>
+    </w:p>
+    <w:p>
+      <w:r>
         <w:t>Answer:</w:t>
+      </w:r>
+    </w:p>
+    <w:p>
+      <w:r>
+        <w:rPr>
+          <w:rFonts w:ascii="Courier New" w:hAnsi="Courier New"/>
+          <w:sz w:val="20"/>
+        </w:rPr>
+        <w:t>`</w:t>
       </w:r>
     </w:p>
     <w:p>
@@ -2222,27 +2336,11 @@
       </w:r>
     </w:p>
     <w:p>
-      <w:pPr>
-        <w:pStyle w:val="ListBullet"/>
-      </w:pPr>
       <w:r>
         <w:rPr>
-          <w:b/>
+          <w:i/>
         </w:rPr>
-        <w:t>⚠️ ACTION (numbers only):</w:t>
-      </w:r>
-      <w:r>
-        <w:t xml:space="preserve"> run the ROUGE-evaluation cell in </w:t>
-      </w:r>
-      <w:r>
-        <w:rPr>
-          <w:rFonts w:ascii="Courier New" w:hAnsi="Courier New"/>
-          <w:sz w:val="20"/>
-        </w:rPr>
-        <w:t>notebooks/03_dl_rag_ui.ipynb</w:t>
-      </w:r>
-      <w:r>
-        <w:t xml:space="preserve"> and paste the three values below — the cell is present but was not executed, so these are the only figures in the report not yet backed by output.</w:t>
+        <w:t>**⚠️ ACTION (numbers only):** run the ROUGE-evaluation cell in `notebooks/03_dl_rag_ui.ipynb` and paste the three values below — the cell is present but was not executed, so these are the only figures in the report not yet backed by output.</w:t>
       </w:r>
     </w:p>
     <w:tbl>

</xml_diff>

<commit_message>
Regenerate report docx with tightened §2.2
</commit_message>
<xml_diff>
--- a/report/ITC6110_report.docx
+++ b/report/ITC6110_report.docx
@@ -707,7 +707,16 @@
         <w:t>99 rows in total</w:t>
       </w:r>
       <w:r>
-        <w:t xml:space="preserve"> — the 57 exact duplicates plus 42 further rows in which the same article text appeared with differing metadata, most notably the same article present in both the train and test split. This left </w:t>
+        <w:t xml:space="preserve"> — the 57 exact duplicates plus </w:t>
+      </w:r>
+      <w:r>
+        <w:rPr>
+          <w:b/>
+        </w:rPr>
+        <w:t>42 articles that appeared in both the train and test split</w:t>
+      </w:r>
+      <w:r>
+        <w:t xml:space="preserve"> (identical text, different split label). This left </w:t>
       </w:r>
       <w:r>
         <w:rPr>
@@ -716,7 +725,7 @@
         <w:t>2,126 unique articles</w:t>
       </w:r>
       <w:r>
-        <w:t>. Deduplicating on text rather than on the full row is deliberate: it is what catches an article that appears in both splits and would otherwise leak between train and test, inflating reported accuracy.</w:t>
+        <w:t>. Deduplicating on text rather than on the full row is deliberate: those 42 cross-split articles are a genuine train/test leak — an article seen in training would be classified correctly at test time for free — so removing them before modelling prevents artificially inflated test accuracy.</w:t>
       </w:r>
     </w:p>
     <w:p>

</xml_diff>